<commit_message>
I50: pages, layers and the approved picture library
Host picture library and resolver, document-side asset versioning,
library pictures for agents (list_assets scopes, execute_script
libraryAssets), page tabs, layers and pictures panels with browser tests.
Also projects connector routes for every page and makes script retries
hash the same when library pictures are involved.

Co-Authored-By: Claude Sonnet 5.5 <noreply@anthropic.com>
</commit_message>
<xml_diff>
--- a/docs/acceptance/evidence/WA-10/report.docx
+++ b/docs/acceptance/evidence/WA-10/report.docx
@@ -4,7 +4,7 @@
   <w:body>
     <w:p>
       <w:r>
-        <w:object w:dxaOrig="12406" w:dyaOrig="8401" w14:anchorId="13A2F9C0">
+        <w:object w:dxaOrig="12406" w:dyaOrig="8401" w14:anchorId="00A220C1">
           <v:shapetype id="_x0000_t75" coordsize="21600,21600" o:spt="75" o:preferrelative="t" path="m@4@5l@4@11@9@11@9@5xe" filled="f" stroked="f">
             <v:stroke joinstyle="miter"/>
             <v:formulas>
@@ -27,7 +27,7 @@
           <v:shape id="_x0000_i1028" type="#_x0000_t75" style="width:620.4pt;height:419.85pt" o:ole="">
             <v:imagedata r:id="rId4" o:title=""/>
           </v:shape>
-          <o:OLEObject Type="Embed" ProgID="Visio.Drawing.15" ShapeID="_x0000_i1028" DrawAspect="Content" ObjectID="_1853776442" r:id="rId5"/>
+          <o:OLEObject Type="Embed" ProgID="Visio.Drawing.15" ShapeID="_x0000_i1028" DrawAspect="Content" ObjectID="_1853778154" r:id="rId5"/>
         </w:object>
       </w:r>
     </w:p>
@@ -449,7 +449,7 @@
     <w:link w:val="Heading1Char"/>
     <w:uiPriority w:val="9"/>
     <w:qFormat/>
-    <w:rsid w:val="00EA55B7"/>
+    <w:rsid w:val="002C6AAF"/>
     <w:pPr>
       <w:keepNext/>
       <w:keepLines/>
@@ -472,7 +472,7 @@
     <w:semiHidden/>
     <w:unhideWhenUsed/>
     <w:qFormat/>
-    <w:rsid w:val="00EA55B7"/>
+    <w:rsid w:val="002C6AAF"/>
     <w:pPr>
       <w:keepNext/>
       <w:keepLines/>
@@ -495,7 +495,7 @@
     <w:semiHidden/>
     <w:unhideWhenUsed/>
     <w:qFormat/>
-    <w:rsid w:val="00EA55B7"/>
+    <w:rsid w:val="002C6AAF"/>
     <w:pPr>
       <w:keepNext/>
       <w:keepLines/>
@@ -518,7 +518,7 @@
     <w:semiHidden/>
     <w:unhideWhenUsed/>
     <w:qFormat/>
-    <w:rsid w:val="00EA55B7"/>
+    <w:rsid w:val="002C6AAF"/>
     <w:pPr>
       <w:keepNext/>
       <w:keepLines/>
@@ -541,7 +541,7 @@
     <w:semiHidden/>
     <w:unhideWhenUsed/>
     <w:qFormat/>
-    <w:rsid w:val="00EA55B7"/>
+    <w:rsid w:val="002C6AAF"/>
     <w:pPr>
       <w:keepNext/>
       <w:keepLines/>
@@ -562,7 +562,7 @@
     <w:semiHidden/>
     <w:unhideWhenUsed/>
     <w:qFormat/>
-    <w:rsid w:val="00EA55B7"/>
+    <w:rsid w:val="002C6AAF"/>
     <w:pPr>
       <w:keepNext/>
       <w:keepLines/>
@@ -585,7 +585,7 @@
     <w:semiHidden/>
     <w:unhideWhenUsed/>
     <w:qFormat/>
-    <w:rsid w:val="00EA55B7"/>
+    <w:rsid w:val="002C6AAF"/>
     <w:pPr>
       <w:keepNext/>
       <w:keepLines/>
@@ -606,7 +606,7 @@
     <w:semiHidden/>
     <w:unhideWhenUsed/>
     <w:qFormat/>
-    <w:rsid w:val="00EA55B7"/>
+    <w:rsid w:val="002C6AAF"/>
     <w:pPr>
       <w:keepNext/>
       <w:keepLines/>
@@ -629,7 +629,7 @@
     <w:semiHidden/>
     <w:unhideWhenUsed/>
     <w:qFormat/>
-    <w:rsid w:val="00EA55B7"/>
+    <w:rsid w:val="002C6AAF"/>
     <w:pPr>
       <w:keepNext/>
       <w:keepLines/>
@@ -717,7 +717,7 @@
     <w:basedOn w:val="DefaultParagraphFont"/>
     <w:link w:val="Heading1"/>
     <w:uiPriority w:val="9"/>
-    <w:rsid w:val="00EA55B7"/>
+    <w:rsid w:val="002C6AAF"/>
     <w:rPr>
       <w:rFonts w:asciiTheme="majorHAnsi" w:eastAsiaTheme="majorEastAsia" w:hAnsiTheme="majorHAnsi" w:cstheme="majorBidi"/>
       <w:color w:val="0F4761" w:themeColor="accent1" w:themeShade="BF"/>
@@ -731,7 +731,7 @@
     <w:link w:val="Heading2"/>
     <w:uiPriority w:val="9"/>
     <w:semiHidden/>
-    <w:rsid w:val="00EA55B7"/>
+    <w:rsid w:val="002C6AAF"/>
     <w:rPr>
       <w:rFonts w:asciiTheme="majorHAnsi" w:eastAsiaTheme="majorEastAsia" w:hAnsiTheme="majorHAnsi" w:cstheme="majorBidi"/>
       <w:color w:val="0F4761" w:themeColor="accent1" w:themeShade="BF"/>
@@ -745,7 +745,7 @@
     <w:link w:val="Heading3"/>
     <w:uiPriority w:val="9"/>
     <w:semiHidden/>
-    <w:rsid w:val="00EA55B7"/>
+    <w:rsid w:val="002C6AAF"/>
     <w:rPr>
       <w:rFonts w:eastAsiaTheme="majorEastAsia" w:cstheme="majorBidi"/>
       <w:color w:val="0F4761" w:themeColor="accent1" w:themeShade="BF"/>
@@ -759,7 +759,7 @@
     <w:link w:val="Heading4"/>
     <w:uiPriority w:val="9"/>
     <w:semiHidden/>
-    <w:rsid w:val="00EA55B7"/>
+    <w:rsid w:val="002C6AAF"/>
     <w:rPr>
       <w:rFonts w:eastAsiaTheme="majorEastAsia" w:cstheme="majorBidi"/>
       <w:i/>
@@ -773,7 +773,7 @@
     <w:link w:val="Heading5"/>
     <w:uiPriority w:val="9"/>
     <w:semiHidden/>
-    <w:rsid w:val="00EA55B7"/>
+    <w:rsid w:val="002C6AAF"/>
     <w:rPr>
       <w:rFonts w:eastAsiaTheme="majorEastAsia" w:cstheme="majorBidi"/>
       <w:color w:val="0F4761" w:themeColor="accent1" w:themeShade="BF"/>
@@ -785,7 +785,7 @@
     <w:link w:val="Heading6"/>
     <w:uiPriority w:val="9"/>
     <w:semiHidden/>
-    <w:rsid w:val="00EA55B7"/>
+    <w:rsid w:val="002C6AAF"/>
     <w:rPr>
       <w:rFonts w:eastAsiaTheme="majorEastAsia" w:cstheme="majorBidi"/>
       <w:i/>
@@ -799,7 +799,7 @@
     <w:link w:val="Heading7"/>
     <w:uiPriority w:val="9"/>
     <w:semiHidden/>
-    <w:rsid w:val="00EA55B7"/>
+    <w:rsid w:val="002C6AAF"/>
     <w:rPr>
       <w:rFonts w:eastAsiaTheme="majorEastAsia" w:cstheme="majorBidi"/>
       <w:color w:val="595959" w:themeColor="text1" w:themeTint="A6"/>
@@ -811,7 +811,7 @@
     <w:link w:val="Heading8"/>
     <w:uiPriority w:val="9"/>
     <w:semiHidden/>
-    <w:rsid w:val="00EA55B7"/>
+    <w:rsid w:val="002C6AAF"/>
     <w:rPr>
       <w:rFonts w:eastAsiaTheme="majorEastAsia" w:cstheme="majorBidi"/>
       <w:i/>
@@ -825,7 +825,7 @@
     <w:link w:val="Heading9"/>
     <w:uiPriority w:val="9"/>
     <w:semiHidden/>
-    <w:rsid w:val="00EA55B7"/>
+    <w:rsid w:val="002C6AAF"/>
     <w:rPr>
       <w:rFonts w:eastAsiaTheme="majorEastAsia" w:cstheme="majorBidi"/>
       <w:color w:val="272727" w:themeColor="text1" w:themeTint="D8"/>
@@ -838,7 +838,7 @@
     <w:link w:val="TitleChar"/>
     <w:uiPriority w:val="10"/>
     <w:qFormat/>
-    <w:rsid w:val="00EA55B7"/>
+    <w:rsid w:val="002C6AAF"/>
     <w:pPr>
       <w:spacing w:after="80" w:line="240" w:lineRule="auto"/>
       <w:contextualSpacing/>
@@ -856,7 +856,7 @@
     <w:basedOn w:val="DefaultParagraphFont"/>
     <w:link w:val="Title"/>
     <w:uiPriority w:val="10"/>
-    <w:rsid w:val="00EA55B7"/>
+    <w:rsid w:val="002C6AAF"/>
     <w:rPr>
       <w:rFonts w:asciiTheme="majorHAnsi" w:eastAsiaTheme="majorEastAsia" w:hAnsiTheme="majorHAnsi" w:cstheme="majorBidi"/>
       <w:spacing w:val="-10"/>
@@ -872,7 +872,7 @@
     <w:link w:val="SubtitleChar"/>
     <w:uiPriority w:val="11"/>
     <w:qFormat/>
-    <w:rsid w:val="00EA55B7"/>
+    <w:rsid w:val="002C6AAF"/>
     <w:pPr>
       <w:numPr>
         <w:ilvl w:val="1"/>
@@ -891,7 +891,7 @@
     <w:basedOn w:val="DefaultParagraphFont"/>
     <w:link w:val="Subtitle"/>
     <w:uiPriority w:val="11"/>
-    <w:rsid w:val="00EA55B7"/>
+    <w:rsid w:val="002C6AAF"/>
     <w:rPr>
       <w:rFonts w:eastAsiaTheme="majorEastAsia" w:cstheme="majorBidi"/>
       <w:color w:val="595959" w:themeColor="text1" w:themeTint="A6"/>
@@ -907,7 +907,7 @@
     <w:link w:val="QuoteChar"/>
     <w:uiPriority w:val="29"/>
     <w:qFormat/>
-    <w:rsid w:val="00EA55B7"/>
+    <w:rsid w:val="002C6AAF"/>
     <w:pPr>
       <w:spacing w:before="160"/>
       <w:jc w:val="center"/>
@@ -923,7 +923,7 @@
     <w:basedOn w:val="DefaultParagraphFont"/>
     <w:link w:val="Quote"/>
     <w:uiPriority w:val="29"/>
-    <w:rsid w:val="00EA55B7"/>
+    <w:rsid w:val="002C6AAF"/>
     <w:rPr>
       <w:i/>
       <w:iCs/>
@@ -935,7 +935,7 @@
     <w:basedOn w:val="Normal"/>
     <w:uiPriority w:val="34"/>
     <w:qFormat/>
-    <w:rsid w:val="00EA55B7"/>
+    <w:rsid w:val="002C6AAF"/>
     <w:pPr>
       <w:ind w:left="720"/>
       <w:contextualSpacing/>
@@ -946,7 +946,7 @@
     <w:basedOn w:val="DefaultParagraphFont"/>
     <w:uiPriority w:val="21"/>
     <w:qFormat/>
-    <w:rsid w:val="00EA55B7"/>
+    <w:rsid w:val="002C6AAF"/>
     <w:rPr>
       <w:i/>
       <w:iCs/>
@@ -960,7 +960,7 @@
     <w:link w:val="IntenseQuoteChar"/>
     <w:uiPriority w:val="30"/>
     <w:qFormat/>
-    <w:rsid w:val="00EA55B7"/>
+    <w:rsid w:val="002C6AAF"/>
     <w:pPr>
       <w:pBdr>
         <w:top w:val="single" w:sz="4" w:space="10" w:color="0F4761" w:themeColor="accent1" w:themeShade="BF"/>
@@ -981,7 +981,7 @@
     <w:basedOn w:val="DefaultParagraphFont"/>
     <w:link w:val="IntenseQuote"/>
     <w:uiPriority w:val="30"/>
-    <w:rsid w:val="00EA55B7"/>
+    <w:rsid w:val="002C6AAF"/>
     <w:rPr>
       <w:i/>
       <w:iCs/>
@@ -993,7 +993,7 @@
     <w:basedOn w:val="DefaultParagraphFont"/>
     <w:uiPriority w:val="32"/>
     <w:qFormat/>
-    <w:rsid w:val="00EA55B7"/>
+    <w:rsid w:val="002C6AAF"/>
     <w:rPr>
       <w:b/>
       <w:bCs/>

</xml_diff>

<commit_message>
I51: durable recovery, export path policy and boundary hardening
Recovery journal and checkpoint store with fault-injection tests, host recovery
manager, startup/renderer-crash restore through the page with a loss report,
blob GC that respects undo and recovery, ExportPathPolicy with consent and
revalidation, static boundary guards and IPC depth tests. Windows tests now run
one at a time because parallel WebView2 windows starved each other.

Co-Authored-By: Claude Sonnet 5.5 <noreply@anthropic.com>
</commit_message>
<xml_diff>
--- a/docs/acceptance/evidence/WA-10/report.docx
+++ b/docs/acceptance/evidence/WA-10/report.docx
@@ -4,7 +4,7 @@
   <w:body>
     <w:p>
       <w:r>
-        <w:object w:dxaOrig="12406" w:dyaOrig="8401" w14:anchorId="00A220C1">
+        <w:object w:dxaOrig="12406" w:dyaOrig="8401" w14:anchorId="4E055235">
           <v:shapetype id="_x0000_t75" coordsize="21600,21600" o:spt="75" o:preferrelative="t" path="m@4@5l@4@11@9@11@9@5xe" filled="f" stroked="f">
             <v:stroke joinstyle="miter"/>
             <v:formulas>
@@ -27,7 +27,7 @@
           <v:shape id="_x0000_i1028" type="#_x0000_t75" style="width:620.4pt;height:419.85pt" o:ole="">
             <v:imagedata r:id="rId4" o:title=""/>
           </v:shape>
-          <o:OLEObject Type="Embed" ProgID="Visio.Drawing.15" ShapeID="_x0000_i1028" DrawAspect="Content" ObjectID="_1853778154" r:id="rId5"/>
+          <o:OLEObject Type="Embed" ProgID="Visio.Drawing.15" ShapeID="_x0000_i1028" DrawAspect="Content" ObjectID="_1853798783" r:id="rId5"/>
         </w:object>
       </w:r>
     </w:p>
@@ -449,7 +449,7 @@
     <w:link w:val="Heading1Char"/>
     <w:uiPriority w:val="9"/>
     <w:qFormat/>
-    <w:rsid w:val="002C6AAF"/>
+    <w:rsid w:val="00D64EF1"/>
     <w:pPr>
       <w:keepNext/>
       <w:keepLines/>
@@ -472,7 +472,7 @@
     <w:semiHidden/>
     <w:unhideWhenUsed/>
     <w:qFormat/>
-    <w:rsid w:val="002C6AAF"/>
+    <w:rsid w:val="00D64EF1"/>
     <w:pPr>
       <w:keepNext/>
       <w:keepLines/>
@@ -495,7 +495,7 @@
     <w:semiHidden/>
     <w:unhideWhenUsed/>
     <w:qFormat/>
-    <w:rsid w:val="002C6AAF"/>
+    <w:rsid w:val="00D64EF1"/>
     <w:pPr>
       <w:keepNext/>
       <w:keepLines/>
@@ -518,7 +518,7 @@
     <w:semiHidden/>
     <w:unhideWhenUsed/>
     <w:qFormat/>
-    <w:rsid w:val="002C6AAF"/>
+    <w:rsid w:val="00D64EF1"/>
     <w:pPr>
       <w:keepNext/>
       <w:keepLines/>
@@ -541,7 +541,7 @@
     <w:semiHidden/>
     <w:unhideWhenUsed/>
     <w:qFormat/>
-    <w:rsid w:val="002C6AAF"/>
+    <w:rsid w:val="00D64EF1"/>
     <w:pPr>
       <w:keepNext/>
       <w:keepLines/>
@@ -562,7 +562,7 @@
     <w:semiHidden/>
     <w:unhideWhenUsed/>
     <w:qFormat/>
-    <w:rsid w:val="002C6AAF"/>
+    <w:rsid w:val="00D64EF1"/>
     <w:pPr>
       <w:keepNext/>
       <w:keepLines/>
@@ -585,7 +585,7 @@
     <w:semiHidden/>
     <w:unhideWhenUsed/>
     <w:qFormat/>
-    <w:rsid w:val="002C6AAF"/>
+    <w:rsid w:val="00D64EF1"/>
     <w:pPr>
       <w:keepNext/>
       <w:keepLines/>
@@ -606,7 +606,7 @@
     <w:semiHidden/>
     <w:unhideWhenUsed/>
     <w:qFormat/>
-    <w:rsid w:val="002C6AAF"/>
+    <w:rsid w:val="00D64EF1"/>
     <w:pPr>
       <w:keepNext/>
       <w:keepLines/>
@@ -629,7 +629,7 @@
     <w:semiHidden/>
     <w:unhideWhenUsed/>
     <w:qFormat/>
-    <w:rsid w:val="002C6AAF"/>
+    <w:rsid w:val="00D64EF1"/>
     <w:pPr>
       <w:keepNext/>
       <w:keepLines/>
@@ -717,7 +717,7 @@
     <w:basedOn w:val="DefaultParagraphFont"/>
     <w:link w:val="Heading1"/>
     <w:uiPriority w:val="9"/>
-    <w:rsid w:val="002C6AAF"/>
+    <w:rsid w:val="00D64EF1"/>
     <w:rPr>
       <w:rFonts w:asciiTheme="majorHAnsi" w:eastAsiaTheme="majorEastAsia" w:hAnsiTheme="majorHAnsi" w:cstheme="majorBidi"/>
       <w:color w:val="0F4761" w:themeColor="accent1" w:themeShade="BF"/>
@@ -731,7 +731,7 @@
     <w:link w:val="Heading2"/>
     <w:uiPriority w:val="9"/>
     <w:semiHidden/>
-    <w:rsid w:val="002C6AAF"/>
+    <w:rsid w:val="00D64EF1"/>
     <w:rPr>
       <w:rFonts w:asciiTheme="majorHAnsi" w:eastAsiaTheme="majorEastAsia" w:hAnsiTheme="majorHAnsi" w:cstheme="majorBidi"/>
       <w:color w:val="0F4761" w:themeColor="accent1" w:themeShade="BF"/>
@@ -745,7 +745,7 @@
     <w:link w:val="Heading3"/>
     <w:uiPriority w:val="9"/>
     <w:semiHidden/>
-    <w:rsid w:val="002C6AAF"/>
+    <w:rsid w:val="00D64EF1"/>
     <w:rPr>
       <w:rFonts w:eastAsiaTheme="majorEastAsia" w:cstheme="majorBidi"/>
       <w:color w:val="0F4761" w:themeColor="accent1" w:themeShade="BF"/>
@@ -759,7 +759,7 @@
     <w:link w:val="Heading4"/>
     <w:uiPriority w:val="9"/>
     <w:semiHidden/>
-    <w:rsid w:val="002C6AAF"/>
+    <w:rsid w:val="00D64EF1"/>
     <w:rPr>
       <w:rFonts w:eastAsiaTheme="majorEastAsia" w:cstheme="majorBidi"/>
       <w:i/>
@@ -773,7 +773,7 @@
     <w:link w:val="Heading5"/>
     <w:uiPriority w:val="9"/>
     <w:semiHidden/>
-    <w:rsid w:val="002C6AAF"/>
+    <w:rsid w:val="00D64EF1"/>
     <w:rPr>
       <w:rFonts w:eastAsiaTheme="majorEastAsia" w:cstheme="majorBidi"/>
       <w:color w:val="0F4761" w:themeColor="accent1" w:themeShade="BF"/>
@@ -785,7 +785,7 @@
     <w:link w:val="Heading6"/>
     <w:uiPriority w:val="9"/>
     <w:semiHidden/>
-    <w:rsid w:val="002C6AAF"/>
+    <w:rsid w:val="00D64EF1"/>
     <w:rPr>
       <w:rFonts w:eastAsiaTheme="majorEastAsia" w:cstheme="majorBidi"/>
       <w:i/>
@@ -799,7 +799,7 @@
     <w:link w:val="Heading7"/>
     <w:uiPriority w:val="9"/>
     <w:semiHidden/>
-    <w:rsid w:val="002C6AAF"/>
+    <w:rsid w:val="00D64EF1"/>
     <w:rPr>
       <w:rFonts w:eastAsiaTheme="majorEastAsia" w:cstheme="majorBidi"/>
       <w:color w:val="595959" w:themeColor="text1" w:themeTint="A6"/>
@@ -811,7 +811,7 @@
     <w:link w:val="Heading8"/>
     <w:uiPriority w:val="9"/>
     <w:semiHidden/>
-    <w:rsid w:val="002C6AAF"/>
+    <w:rsid w:val="00D64EF1"/>
     <w:rPr>
       <w:rFonts w:eastAsiaTheme="majorEastAsia" w:cstheme="majorBidi"/>
       <w:i/>
@@ -825,7 +825,7 @@
     <w:link w:val="Heading9"/>
     <w:uiPriority w:val="9"/>
     <w:semiHidden/>
-    <w:rsid w:val="002C6AAF"/>
+    <w:rsid w:val="00D64EF1"/>
     <w:rPr>
       <w:rFonts w:eastAsiaTheme="majorEastAsia" w:cstheme="majorBidi"/>
       <w:color w:val="272727" w:themeColor="text1" w:themeTint="D8"/>
@@ -838,7 +838,7 @@
     <w:link w:val="TitleChar"/>
     <w:uiPriority w:val="10"/>
     <w:qFormat/>
-    <w:rsid w:val="002C6AAF"/>
+    <w:rsid w:val="00D64EF1"/>
     <w:pPr>
       <w:spacing w:after="80" w:line="240" w:lineRule="auto"/>
       <w:contextualSpacing/>
@@ -856,7 +856,7 @@
     <w:basedOn w:val="DefaultParagraphFont"/>
     <w:link w:val="Title"/>
     <w:uiPriority w:val="10"/>
-    <w:rsid w:val="002C6AAF"/>
+    <w:rsid w:val="00D64EF1"/>
     <w:rPr>
       <w:rFonts w:asciiTheme="majorHAnsi" w:eastAsiaTheme="majorEastAsia" w:hAnsiTheme="majorHAnsi" w:cstheme="majorBidi"/>
       <w:spacing w:val="-10"/>
@@ -872,7 +872,7 @@
     <w:link w:val="SubtitleChar"/>
     <w:uiPriority w:val="11"/>
     <w:qFormat/>
-    <w:rsid w:val="002C6AAF"/>
+    <w:rsid w:val="00D64EF1"/>
     <w:pPr>
       <w:numPr>
         <w:ilvl w:val="1"/>
@@ -891,7 +891,7 @@
     <w:basedOn w:val="DefaultParagraphFont"/>
     <w:link w:val="Subtitle"/>
     <w:uiPriority w:val="11"/>
-    <w:rsid w:val="002C6AAF"/>
+    <w:rsid w:val="00D64EF1"/>
     <w:rPr>
       <w:rFonts w:eastAsiaTheme="majorEastAsia" w:cstheme="majorBidi"/>
       <w:color w:val="595959" w:themeColor="text1" w:themeTint="A6"/>
@@ -907,7 +907,7 @@
     <w:link w:val="QuoteChar"/>
     <w:uiPriority w:val="29"/>
     <w:qFormat/>
-    <w:rsid w:val="002C6AAF"/>
+    <w:rsid w:val="00D64EF1"/>
     <w:pPr>
       <w:spacing w:before="160"/>
       <w:jc w:val="center"/>
@@ -923,7 +923,7 @@
     <w:basedOn w:val="DefaultParagraphFont"/>
     <w:link w:val="Quote"/>
     <w:uiPriority w:val="29"/>
-    <w:rsid w:val="002C6AAF"/>
+    <w:rsid w:val="00D64EF1"/>
     <w:rPr>
       <w:i/>
       <w:iCs/>
@@ -935,7 +935,7 @@
     <w:basedOn w:val="Normal"/>
     <w:uiPriority w:val="34"/>
     <w:qFormat/>
-    <w:rsid w:val="002C6AAF"/>
+    <w:rsid w:val="00D64EF1"/>
     <w:pPr>
       <w:ind w:left="720"/>
       <w:contextualSpacing/>
@@ -946,7 +946,7 @@
     <w:basedOn w:val="DefaultParagraphFont"/>
     <w:uiPriority w:val="21"/>
     <w:qFormat/>
-    <w:rsid w:val="002C6AAF"/>
+    <w:rsid w:val="00D64EF1"/>
     <w:rPr>
       <w:i/>
       <w:iCs/>
@@ -960,7 +960,7 @@
     <w:link w:val="IntenseQuoteChar"/>
     <w:uiPriority w:val="30"/>
     <w:qFormat/>
-    <w:rsid w:val="002C6AAF"/>
+    <w:rsid w:val="00D64EF1"/>
     <w:pPr>
       <w:pBdr>
         <w:top w:val="single" w:sz="4" w:space="10" w:color="0F4761" w:themeColor="accent1" w:themeShade="BF"/>
@@ -981,7 +981,7 @@
     <w:basedOn w:val="DefaultParagraphFont"/>
     <w:link w:val="IntenseQuote"/>
     <w:uiPriority w:val="30"/>
-    <w:rsid w:val="002C6AAF"/>
+    <w:rsid w:val="00D64EF1"/>
     <w:rPr>
       <w:i/>
       <w:iCs/>
@@ -993,7 +993,7 @@
     <w:basedOn w:val="DefaultParagraphFont"/>
     <w:uiPriority w:val="32"/>
     <w:qFormat/>
-    <w:rsid w:val="002C6AAF"/>
+    <w:rsid w:val="00D64EF1"/>
     <w:rPr>
       <w:b/>
       <w:bCs/>

</xml_diff>